<commit_message>
Últimos recursos de DAW
</commit_message>
<xml_diff>
--- a/Trabajos/Computación en la Nube/iMarin_CN_UD2_P2.docx
+++ b/Trabajos/Computación en la Nube/iMarin_CN_UD2_P2.docx
@@ -117,6 +117,7 @@
                                     <w:dataBinding w:prefixMappings="xmlns:ns0='http://purl.org/dc/elements/1.1/' xmlns:ns1='http://schemas.openxmlformats.org/package/2006/metadata/core-properties' " w:xpath="/ns1:coreProperties[1]/ns0:title[1]" w:storeItemID="{6C3C8BC8-F283-45AE-878A-BAB7291924A1}"/>
                                     <w:text/>
                                   </w:sdtPr>
+                                  <w:sdtEndPr/>
                                   <w:sdtContent>
                                     <w:r>
                                       <w:rPr>
@@ -917,6 +918,10 @@
         <w:spacing w:after="240"/>
       </w:pPr>
       <w:r>
+        <w:rPr>
+          <w:noProof/>
+          <w:lang w:eastAsia="es-ES"/>
+        </w:rPr>
         <w:drawing>
           <wp:inline distT="0" distB="0" distL="0" distR="0" wp14:anchorId="48332223" wp14:editId="6CB17AA5">
             <wp:extent cx="5400040" cy="3500120"/>
@@ -979,6 +984,10 @@
         <w:spacing w:after="240"/>
       </w:pPr>
       <w:r>
+        <w:rPr>
+          <w:noProof/>
+          <w:lang w:eastAsia="es-ES"/>
+        </w:rPr>
         <w:drawing>
           <wp:inline distT="0" distB="0" distL="0" distR="0" wp14:anchorId="6FBAF54A" wp14:editId="726100B4">
             <wp:extent cx="5400040" cy="3498850"/>
@@ -1021,15 +1030,7 @@
         <w:spacing w:after="240"/>
       </w:pPr>
       <w:r>
-        <w:t xml:space="preserve">Monitorización del consumo de CPU durante una prueba de carga mediante cuatro procesos ejecutados en </w:t>
-      </w:r>
-      <w:proofErr w:type="spellStart"/>
-      <w:r>
-        <w:t>PowerShell</w:t>
-      </w:r>
-      <w:proofErr w:type="spellEnd"/>
-      <w:r>
-        <w:t>.</w:t>
+        <w:t>Monitorización del consumo de CPU durante una prueba de carga mediante cuatro procesos ejecutados en PowerShell.</w:t>
       </w:r>
     </w:p>
     <w:p>
@@ -1037,6 +1038,10 @@
         <w:spacing w:after="240"/>
       </w:pPr>
       <w:r>
+        <w:rPr>
+          <w:noProof/>
+          <w:lang w:eastAsia="es-ES"/>
+        </w:rPr>
         <w:lastRenderedPageBreak/>
         <w:drawing>
           <wp:inline distT="0" distB="0" distL="0" distR="0" wp14:anchorId="0E64FE18" wp14:editId="53748635">
@@ -1094,6 +1099,10 @@
         <w:spacing w:after="240"/>
       </w:pPr>
       <w:r>
+        <w:rPr>
+          <w:noProof/>
+          <w:lang w:eastAsia="es-ES"/>
+        </w:rPr>
         <w:drawing>
           <wp:inline distT="0" distB="0" distL="0" distR="0" wp14:anchorId="384D6E87" wp14:editId="0D9611A1">
             <wp:extent cx="5400040" cy="3505200"/>
@@ -1150,6 +1159,10 @@
         <w:spacing w:after="240"/>
       </w:pPr>
       <w:r>
+        <w:rPr>
+          <w:noProof/>
+          <w:lang w:eastAsia="es-ES"/>
+        </w:rPr>
         <w:lastRenderedPageBreak/>
         <w:drawing>
           <wp:inline distT="0" distB="0" distL="0" distR="0" wp14:anchorId="512F0622" wp14:editId="140B2C7B">
@@ -1193,15 +1206,7 @@
         <w:spacing w:after="240"/>
       </w:pPr>
       <w:r>
-        <w:t xml:space="preserve">En </w:t>
-      </w:r>
-      <w:proofErr w:type="spellStart"/>
-      <w:r>
-        <w:t>Powershell</w:t>
-      </w:r>
-      <w:proofErr w:type="spellEnd"/>
-      <w:r>
-        <w:t xml:space="preserve">, usamos este comando para efectuar una descarga de 100MB de datos de internet </w:t>
+        <w:t xml:space="preserve">En Powershell, usamos este comando para efectuar una descarga de 100MB de datos de internet </w:t>
       </w:r>
       <w:r>
         <w:t>para generar tráfico de entrada de red.</w:t>
@@ -1212,6 +1217,10 @@
         <w:spacing w:after="240"/>
       </w:pPr>
       <w:r>
+        <w:rPr>
+          <w:noProof/>
+          <w:lang w:eastAsia="es-ES"/>
+        </w:rPr>
         <w:drawing>
           <wp:inline distT="0" distB="0" distL="0" distR="0" wp14:anchorId="0BB63444" wp14:editId="67FFD66A">
             <wp:extent cx="5400040" cy="3491865"/>
@@ -1277,6 +1286,10 @@
         <w:spacing w:after="240"/>
       </w:pPr>
       <w:r>
+        <w:rPr>
+          <w:noProof/>
+          <w:lang w:eastAsia="es-ES"/>
+        </w:rPr>
         <w:lastRenderedPageBreak/>
         <w:drawing>
           <wp:inline distT="0" distB="0" distL="0" distR="0" wp14:anchorId="5CD185CF" wp14:editId="6D074637">
@@ -1320,10 +1333,7 @@
         <w:spacing w:after="240"/>
       </w:pPr>
       <w:r>
-        <w:t>Gráfica de m</w:t>
-      </w:r>
-      <w:r>
-        <w:t>onitorización de las operaciones de escritura en disco de la máquina virtual.</w:t>
+        <w:t>Gráfica de monitorización de las operaciones de escritura en disco de la máquina virtual.</w:t>
       </w:r>
     </w:p>
     <w:p>
@@ -1331,6 +1341,10 @@
         <w:spacing w:after="240"/>
       </w:pPr>
       <w:r>
+        <w:rPr>
+          <w:noProof/>
+          <w:lang w:eastAsia="es-ES"/>
+        </w:rPr>
         <w:drawing>
           <wp:inline distT="0" distB="0" distL="0" distR="0" wp14:anchorId="4B1D9B06" wp14:editId="49D11683">
             <wp:extent cx="5400040" cy="3920490"/>
@@ -1376,18 +1390,10 @@
         <w:t>Con este código</w:t>
       </w:r>
       <w:r>
-        <w:t xml:space="preserve"> en </w:t>
-      </w:r>
-      <w:proofErr w:type="spellStart"/>
-      <w:r>
-        <w:t>Powershell</w:t>
-      </w:r>
-      <w:proofErr w:type="spellEnd"/>
-      <w:r>
-        <w:t>, creamos</w:t>
-      </w:r>
-      <w:r>
-        <w:t xml:space="preserve"> un archivo tem</w:t>
+        <w:t xml:space="preserve"> en Powershell</w:t>
+      </w:r>
+      <w:r>
+        <w:t>, creamos un archivo tem</w:t>
       </w:r>
       <w:r>
         <w:t xml:space="preserve">poral de 512 MB </w:t>
@@ -1401,6 +1407,10 @@
         <w:spacing w:after="240"/>
       </w:pPr>
       <w:r>
+        <w:rPr>
+          <w:noProof/>
+          <w:lang w:eastAsia="es-ES"/>
+        </w:rPr>
         <w:lastRenderedPageBreak/>
         <w:drawing>
           <wp:inline distT="0" distB="0" distL="0" distR="0" wp14:anchorId="7559778D" wp14:editId="044C65DF">
@@ -1452,6 +1462,10 @@
         <w:spacing w:after="240"/>
       </w:pPr>
       <w:r>
+        <w:rPr>
+          <w:noProof/>
+          <w:lang w:eastAsia="es-ES"/>
+        </w:rPr>
         <w:drawing>
           <wp:inline distT="0" distB="0" distL="0" distR="0" wp14:anchorId="01ECC30E" wp14:editId="7303958C">
             <wp:extent cx="5400040" cy="797560"/>
@@ -1524,6 +1538,388 @@
     </w:p>
     <w:p>
       <w:pPr>
+        <w:pStyle w:val="Ttulo1"/>
+        <w:spacing w:after="240"/>
+      </w:pPr>
+      <w:bookmarkStart w:id="2" w:name="_Toc240646881"/>
+      <w:bookmarkStart w:id="3" w:name="_Toc243672838"/>
+      <w:r>
+        <w:rPr>
+          <w:rFonts w:asciiTheme="minorHAnsi" w:eastAsiaTheme="minorHAnsi" w:hAnsiTheme="minorHAnsi" w:cstheme="minorBidi"/>
+          <w:b/>
+          <w:color w:val="auto"/>
+          <w:sz w:val="22"/>
+          <w:szCs w:val="22"/>
+        </w:rPr>
+        <w:drawing>
+          <wp:inline distT="0" distB="0" distL="0" distR="0" wp14:anchorId="5DBC0C63" wp14:editId="18B21995">
+            <wp:extent cx="5400040" cy="2857500"/>
+            <wp:effectExtent l="0" t="0" r="0" b="0"/>
+            <wp:docPr id="10" name="Imagen 10"/>
+            <wp:cNvGraphicFramePr>
+              <a:graphicFrameLocks xmlns:a="http://schemas.openxmlformats.org/drawingml/2006/main" noChangeAspect="1"/>
+            </wp:cNvGraphicFramePr>
+            <a:graphic xmlns:a="http://schemas.openxmlformats.org/drawingml/2006/main">
+              <a:graphicData uri="http://schemas.openxmlformats.org/drawingml/2006/picture">
+                <pic:pic xmlns:pic="http://schemas.openxmlformats.org/drawingml/2006/picture">
+                  <pic:nvPicPr>
+                    <pic:cNvPr id="1" name=""/>
+                    <pic:cNvPicPr/>
+                  </pic:nvPicPr>
+                  <pic:blipFill>
+                    <a:blip r:embed="rId18"/>
+                    <a:stretch>
+                      <a:fillRect/>
+                    </a:stretch>
+                  </pic:blipFill>
+                  <pic:spPr>
+                    <a:xfrm>
+                      <a:off x="0" y="0"/>
+                      <a:ext cx="5400040" cy="2857500"/>
+                    </a:xfrm>
+                    <a:prstGeom prst="rect">
+                      <a:avLst/>
+                    </a:prstGeom>
+                  </pic:spPr>
+                </pic:pic>
+              </a:graphicData>
+            </a:graphic>
+          </wp:inline>
+        </w:drawing>
+      </w:r>
+    </w:p>
+    <w:p>
+      <w:r>
+        <w:t xml:space="preserve">Configuración de una alerta para detectar </w:t>
+      </w:r>
+      <w:r>
+        <w:t>cuando el</w:t>
+      </w:r>
+      <w:r>
+        <w:t xml:space="preserve"> consumo promedio de CPU </w:t>
+      </w:r>
+      <w:r>
+        <w:t xml:space="preserve">sea </w:t>
+      </w:r>
+      <w:r>
+        <w:t>superior al 60 %, con evaluaciones cada minuto.</w:t>
+      </w:r>
+    </w:p>
+    <w:p>
+      <w:r>
+        <w:drawing>
+          <wp:inline distT="0" distB="0" distL="0" distR="0" wp14:anchorId="7B748C15" wp14:editId="54AB9953">
+            <wp:extent cx="5400040" cy="3905885"/>
+            <wp:effectExtent l="0" t="0" r="0" b="0"/>
+            <wp:docPr id="12" name="Imagen 12"/>
+            <wp:cNvGraphicFramePr>
+              <a:graphicFrameLocks xmlns:a="http://schemas.openxmlformats.org/drawingml/2006/main" noChangeAspect="1"/>
+            </wp:cNvGraphicFramePr>
+            <a:graphic xmlns:a="http://schemas.openxmlformats.org/drawingml/2006/main">
+              <a:graphicData uri="http://schemas.openxmlformats.org/drawingml/2006/picture">
+                <pic:pic xmlns:pic="http://schemas.openxmlformats.org/drawingml/2006/picture">
+                  <pic:nvPicPr>
+                    <pic:cNvPr id="1" name=""/>
+                    <pic:cNvPicPr/>
+                  </pic:nvPicPr>
+                  <pic:blipFill>
+                    <a:blip r:embed="rId19"/>
+                    <a:stretch>
+                      <a:fillRect/>
+                    </a:stretch>
+                  </pic:blipFill>
+                  <pic:spPr>
+                    <a:xfrm>
+                      <a:off x="0" y="0"/>
+                      <a:ext cx="5400040" cy="3905885"/>
+                    </a:xfrm>
+                    <a:prstGeom prst="rect">
+                      <a:avLst/>
+                    </a:prstGeom>
+                  </pic:spPr>
+                </pic:pic>
+              </a:graphicData>
+            </a:graphic>
+          </wp:inline>
+        </w:drawing>
+      </w:r>
+    </w:p>
+    <w:p>
+      <w:r>
+        <w:t>Configuración de un grupo de acciones para recibir notificaciones por correo electrónico cuando se active la alerta de CPU.</w:t>
+      </w:r>
+      <w:r>
+        <w:t xml:space="preserve"> En mi caso, he puesto el correo de Educantabria, para poder recibir las alertas y leerlas.</w:t>
+      </w:r>
+    </w:p>
+    <w:p>
+      <w:r>
+        <w:lastRenderedPageBreak/>
+        <w:drawing>
+          <wp:inline distT="0" distB="0" distL="0" distR="0" wp14:anchorId="6170B317" wp14:editId="4D572AD4">
+            <wp:extent cx="5400040" cy="3181985"/>
+            <wp:effectExtent l="0" t="0" r="0" b="0"/>
+            <wp:docPr id="13" name="Imagen 13"/>
+            <wp:cNvGraphicFramePr>
+              <a:graphicFrameLocks xmlns:a="http://schemas.openxmlformats.org/drawingml/2006/main" noChangeAspect="1"/>
+            </wp:cNvGraphicFramePr>
+            <a:graphic xmlns:a="http://schemas.openxmlformats.org/drawingml/2006/main">
+              <a:graphicData uri="http://schemas.openxmlformats.org/drawingml/2006/picture">
+                <pic:pic xmlns:pic="http://schemas.openxmlformats.org/drawingml/2006/picture">
+                  <pic:nvPicPr>
+                    <pic:cNvPr id="1" name=""/>
+                    <pic:cNvPicPr/>
+                  </pic:nvPicPr>
+                  <pic:blipFill>
+                    <a:blip r:embed="rId20"/>
+                    <a:stretch>
+                      <a:fillRect/>
+                    </a:stretch>
+                  </pic:blipFill>
+                  <pic:spPr>
+                    <a:xfrm>
+                      <a:off x="0" y="0"/>
+                      <a:ext cx="5400040" cy="3181985"/>
+                    </a:xfrm>
+                    <a:prstGeom prst="rect">
+                      <a:avLst/>
+                    </a:prstGeom>
+                  </pic:spPr>
+                </pic:pic>
+              </a:graphicData>
+            </a:graphic>
+          </wp:inline>
+        </w:drawing>
+      </w:r>
+    </w:p>
+    <w:p>
+      <w:r>
+        <w:t>Configuración de los datos identificativos y la gravedad de la alerta de consumo de CPU</w:t>
+      </w:r>
+      <w:r>
+        <w:t xml:space="preserve"> de la máquina virtual</w:t>
+      </w:r>
+      <w:r>
+        <w:t>.</w:t>
+      </w:r>
+    </w:p>
+    <w:p>
+      <w:r>
+        <w:t>A continuación, se muestra la r</w:t>
+      </w:r>
+      <w:r>
+        <w:t xml:space="preserve">evisión </w:t>
+      </w:r>
+      <w:r>
+        <w:t xml:space="preserve">general </w:t>
+      </w:r>
+      <w:r>
+        <w:t xml:space="preserve">de </w:t>
+      </w:r>
+      <w:r>
+        <w:t xml:space="preserve">los detalles de </w:t>
+      </w:r>
+      <w:r>
+        <w:t xml:space="preserve">la alerta </w:t>
+      </w:r>
+      <w:r>
+        <w:t>configurada</w:t>
+      </w:r>
+      <w:r>
+        <w:t>.</w:t>
+      </w:r>
+    </w:p>
+    <w:p>
+      <w:r>
+        <w:drawing>
+          <wp:inline distT="0" distB="0" distL="0" distR="0" wp14:anchorId="1A06A1BE" wp14:editId="31FDDA79">
+            <wp:extent cx="5400040" cy="4089400"/>
+            <wp:effectExtent l="0" t="0" r="0" b="6350"/>
+            <wp:docPr id="14" name="Imagen 14"/>
+            <wp:cNvGraphicFramePr>
+              <a:graphicFrameLocks xmlns:a="http://schemas.openxmlformats.org/drawingml/2006/main" noChangeAspect="1"/>
+            </wp:cNvGraphicFramePr>
+            <a:graphic xmlns:a="http://schemas.openxmlformats.org/drawingml/2006/main">
+              <a:graphicData uri="http://schemas.openxmlformats.org/drawingml/2006/picture">
+                <pic:pic xmlns:pic="http://schemas.openxmlformats.org/drawingml/2006/picture">
+                  <pic:nvPicPr>
+                    <pic:cNvPr id="1" name=""/>
+                    <pic:cNvPicPr/>
+                  </pic:nvPicPr>
+                  <pic:blipFill>
+                    <a:blip r:embed="rId21"/>
+                    <a:stretch>
+                      <a:fillRect/>
+                    </a:stretch>
+                  </pic:blipFill>
+                  <pic:spPr>
+                    <a:xfrm>
+                      <a:off x="0" y="0"/>
+                      <a:ext cx="5400040" cy="4089400"/>
+                    </a:xfrm>
+                    <a:prstGeom prst="rect">
+                      <a:avLst/>
+                    </a:prstGeom>
+                  </pic:spPr>
+                </pic:pic>
+              </a:graphicData>
+            </a:graphic>
+          </wp:inline>
+        </w:drawing>
+      </w:r>
+    </w:p>
+    <w:p>
+      <w:r>
+        <w:lastRenderedPageBreak/>
+        <w:drawing>
+          <wp:inline distT="0" distB="0" distL="0" distR="0" wp14:anchorId="529927A3" wp14:editId="53586A03">
+            <wp:extent cx="5400040" cy="4006215"/>
+            <wp:effectExtent l="0" t="0" r="0" b="0"/>
+            <wp:docPr id="15" name="Imagen 15"/>
+            <wp:cNvGraphicFramePr>
+              <a:graphicFrameLocks xmlns:a="http://schemas.openxmlformats.org/drawingml/2006/main" noChangeAspect="1"/>
+            </wp:cNvGraphicFramePr>
+            <a:graphic xmlns:a="http://schemas.openxmlformats.org/drawingml/2006/main">
+              <a:graphicData uri="http://schemas.openxmlformats.org/drawingml/2006/picture">
+                <pic:pic xmlns:pic="http://schemas.openxmlformats.org/drawingml/2006/picture">
+                  <pic:nvPicPr>
+                    <pic:cNvPr id="1" name=""/>
+                    <pic:cNvPicPr/>
+                  </pic:nvPicPr>
+                  <pic:blipFill>
+                    <a:blip r:embed="rId22"/>
+                    <a:stretch>
+                      <a:fillRect/>
+                    </a:stretch>
+                  </pic:blipFill>
+                  <pic:spPr>
+                    <a:xfrm>
+                      <a:off x="0" y="0"/>
+                      <a:ext cx="5400040" cy="4006215"/>
+                    </a:xfrm>
+                    <a:prstGeom prst="rect">
+                      <a:avLst/>
+                    </a:prstGeom>
+                  </pic:spPr>
+                </pic:pic>
+              </a:graphicData>
+            </a:graphic>
+          </wp:inline>
+        </w:drawing>
+      </w:r>
+    </w:p>
+    <w:p>
+      <w:r>
+        <w:t>Ahora pulsaremos “Crear”.</w:t>
+      </w:r>
+    </w:p>
+    <w:p>
+      <w:r>
+        <w:lastRenderedPageBreak/>
+        <w:drawing>
+          <wp:inline distT="0" distB="0" distL="0" distR="0" wp14:anchorId="6ED27902" wp14:editId="05D1C6D9">
+            <wp:extent cx="5400040" cy="5790565"/>
+            <wp:effectExtent l="0" t="0" r="0" b="635"/>
+            <wp:docPr id="16" name="Imagen 16"/>
+            <wp:cNvGraphicFramePr>
+              <a:graphicFrameLocks xmlns:a="http://schemas.openxmlformats.org/drawingml/2006/main" noChangeAspect="1"/>
+            </wp:cNvGraphicFramePr>
+            <a:graphic xmlns:a="http://schemas.openxmlformats.org/drawingml/2006/main">
+              <a:graphicData uri="http://schemas.openxmlformats.org/drawingml/2006/picture">
+                <pic:pic xmlns:pic="http://schemas.openxmlformats.org/drawingml/2006/picture">
+                  <pic:nvPicPr>
+                    <pic:cNvPr id="1" name=""/>
+                    <pic:cNvPicPr/>
+                  </pic:nvPicPr>
+                  <pic:blipFill>
+                    <a:blip r:embed="rId23"/>
+                    <a:stretch>
+                      <a:fillRect/>
+                    </a:stretch>
+                  </pic:blipFill>
+                  <pic:spPr>
+                    <a:xfrm>
+                      <a:off x="0" y="0"/>
+                      <a:ext cx="5400040" cy="5790565"/>
+                    </a:xfrm>
+                    <a:prstGeom prst="rect">
+                      <a:avLst/>
+                    </a:prstGeom>
+                  </pic:spPr>
+                </pic:pic>
+              </a:graphicData>
+            </a:graphic>
+          </wp:inline>
+        </w:drawing>
+      </w:r>
+    </w:p>
+    <w:p>
+      <w:r>
+        <w:t>Aquí se muestra el contenido del correo electrónico de confirmación que llega una vez creada la alerta (el correo llega a la dirección especificada en las acciones rápidas).</w:t>
+      </w:r>
+    </w:p>
+    <w:p>
+      <w:r>
+        <w:lastRenderedPageBreak/>
+        <w:drawing>
+          <wp:inline distT="0" distB="0" distL="0" distR="0" wp14:anchorId="3AA3732A" wp14:editId="77BF4229">
+            <wp:extent cx="5400040" cy="2707005"/>
+            <wp:effectExtent l="0" t="0" r="0" b="0"/>
+            <wp:docPr id="17" name="Imagen 17"/>
+            <wp:cNvGraphicFramePr>
+              <a:graphicFrameLocks xmlns:a="http://schemas.openxmlformats.org/drawingml/2006/main" noChangeAspect="1"/>
+            </wp:cNvGraphicFramePr>
+            <a:graphic xmlns:a="http://schemas.openxmlformats.org/drawingml/2006/main">
+              <a:graphicData uri="http://schemas.openxmlformats.org/drawingml/2006/picture">
+                <pic:pic xmlns:pic="http://schemas.openxmlformats.org/drawingml/2006/picture">
+                  <pic:nvPicPr>
+                    <pic:cNvPr id="1" name=""/>
+                    <pic:cNvPicPr/>
+                  </pic:nvPicPr>
+                  <pic:blipFill>
+                    <a:blip r:embed="rId24"/>
+                    <a:stretch>
+                      <a:fillRect/>
+                    </a:stretch>
+                  </pic:blipFill>
+                  <pic:spPr>
+                    <a:xfrm>
+                      <a:off x="0" y="0"/>
+                      <a:ext cx="5400040" cy="2707005"/>
+                    </a:xfrm>
+                    <a:prstGeom prst="rect">
+                      <a:avLst/>
+                    </a:prstGeom>
+                  </pic:spPr>
+                </pic:pic>
+              </a:graphicData>
+            </a:graphic>
+          </wp:inline>
+        </w:drawing>
+      </w:r>
+    </w:p>
+    <w:p>
+      <w:r>
+        <w:t>Comprobación de que la regla de alerta de CPU se ha creado y habilitado correctamente.</w:t>
+      </w:r>
+    </w:p>
+    <w:p>
+      <w:bookmarkStart w:id="4" w:name="_GoBack"/>
+      <w:bookmarkEnd w:id="4"/>
+    </w:p>
+    <w:p>
+      <w:pPr>
+        <w:pStyle w:val="Ttulo1"/>
+        <w:spacing w:after="240"/>
+      </w:pPr>
+      <w:r>
+        <w:t>Ejercicio 3</w:t>
+      </w:r>
+      <w:bookmarkEnd w:id="2"/>
+      <w:bookmarkEnd w:id="3"/>
+    </w:p>
+    <w:p>
+      <w:pPr>
         <w:spacing w:after="240"/>
         <w:rPr>
           <w:b/>
@@ -1543,57 +1939,20 @@
       <w:r>
         <w:t>Respuesta</w:t>
       </w:r>
-      <w:bookmarkStart w:id="2" w:name="_GoBack"/>
-      <w:bookmarkEnd w:id="2"/>
+    </w:p>
+    <w:p>
+      <w:pPr>
+        <w:spacing w:after="240"/>
+      </w:pPr>
+      <w:r>
+        <w:br w:type="page"/>
+      </w:r>
     </w:p>
     <w:p>
       <w:pPr>
         <w:pStyle w:val="Ttulo1"/>
         <w:spacing w:after="240"/>
       </w:pPr>
-      <w:bookmarkStart w:id="3" w:name="_Toc240646881"/>
-      <w:bookmarkStart w:id="4" w:name="_Toc243672838"/>
-      <w:r>
-        <w:t>Ejercicio 3</w:t>
-      </w:r>
-      <w:bookmarkEnd w:id="3"/>
-      <w:bookmarkEnd w:id="4"/>
-    </w:p>
-    <w:p>
-      <w:pPr>
-        <w:spacing w:after="240"/>
-        <w:rPr>
-          <w:b/>
-        </w:rPr>
-      </w:pPr>
-      <w:r>
-        <w:rPr>
-          <w:b/>
-        </w:rPr>
-        <w:t>Enunciado…</w:t>
-      </w:r>
-    </w:p>
-    <w:p>
-      <w:pPr>
-        <w:spacing w:after="240"/>
-      </w:pPr>
-      <w:r>
-        <w:t>Respuesta</w:t>
-      </w:r>
-    </w:p>
-    <w:p>
-      <w:pPr>
-        <w:spacing w:after="240"/>
-      </w:pPr>
-      <w:r>
-        <w:br w:type="page"/>
-      </w:r>
-    </w:p>
-    <w:p>
-      <w:pPr>
-        <w:pStyle w:val="Ttulo1"/>
-        <w:spacing w:after="240"/>
-      </w:pPr>
       <w:bookmarkStart w:id="5" w:name="_Toc240646882"/>
       <w:bookmarkStart w:id="6" w:name="_Toc243672839"/>
       <w:r>
@@ -1620,9 +1979,9 @@
       </w:r>
     </w:p>
     <w:sectPr>
-      <w:headerReference w:type="default" r:id="rId18"/>
-      <w:footerReference w:type="default" r:id="rId19"/>
-      <w:headerReference w:type="first" r:id="rId20"/>
+      <w:headerReference w:type="default" r:id="rId25"/>
+      <w:footerReference w:type="default" r:id="rId26"/>
+      <w:headerReference w:type="first" r:id="rId27"/>
       <w:pgSz w:w="11906" w:h="16838"/>
       <w:pgMar w:top="1417" w:right="1701" w:bottom="1417" w:left="1701" w:header="708" w:footer="708" w:gutter="0"/>
       <w:pgNumType w:start="0"/>
@@ -1689,7 +2048,7 @@
           <w:rPr>
             <w:noProof/>
           </w:rPr>
-          <w:t>7</w:t>
+          <w:t>12</w:t>
         </w:r>
         <w:r>
           <w:fldChar w:fldCharType="end"/>
@@ -2657,7 +3016,7 @@
 </file>
 
 <file path=customXml/itemProps2.xml><?xml version="1.0" encoding="utf-8"?>
-<ds:datastoreItem xmlns:ds="http://schemas.openxmlformats.org/officeDocument/2006/customXml" ds:itemID="{B16252F2-BEEF-4E1E-9FA6-F8049EB380FB}">
+<ds:datastoreItem xmlns:ds="http://schemas.openxmlformats.org/officeDocument/2006/customXml" ds:itemID="{65E68C8A-C6A4-4BA4-84FE-566041A1052B}">
   <ds:schemaRefs>
     <ds:schemaRef ds:uri="http://schemas.openxmlformats.org/officeDocument/2006/bibliography"/>
   </ds:schemaRefs>

</xml_diff>